<commit_message>
Remove laboratory work 1 report
</commit_message>
<xml_diff>
--- a/Звіт_ЛР2_варіант_11.docx
+++ b/Звіт_ЛР2_варіант_11.docx
@@ -3984,7 +3984,7 @@
         <w:rPr>
           <w:rtl w:val="0"/>
         </w:rPr>
-        <w:t xml:space="preserve">Роботу виконано в тому самому Git-репозиторії, що й лабораторну роботу №1 (клон github.com/NKobryn/restaurant-orders). У межах лабораторної роботи №2 створено 7 логічних комітів поверх 5 комітів лабораторної роботи №1: шість комітів із кодом, тестами й документацією та останній коміт, яким до репозиторію додано цей звіт (так само, як звіт лабораторної роботи №1):</w:t>
+        <w:t xml:space="preserve">Роботу виконано в тому самому Git-репозиторії, що й лабораторну роботу №1 (клон github.com/NKobryn/restaurant-orders). У межах лабораторної роботи №2 створено 8 логічних комітів поверх 5 комітів лабораторної роботи №1: шість комітів із кодом, тестами й документацією, коміт, яким до репозиторію додано цей звіт, і останній коміт, у якому з репозиторію прибрано звіт лабораторної роботи №1 (система перевірки приймає лише один звіт) та збережено остаточну версію цього звіту:</w:t>
       </w:r>
     </w:p>
     <w:p>
@@ -4030,6 +4030,14 @@
         <w:t xml:space="preserve">git commit -m "Add laboratory work 2 report"</w:t>
         <w:br/>
         <w:t xml:space="preserve">git push origin main</w:t>
+        <w:br/>
+        <w:t xml:space="preserve">git rm Звіт_ЛР1_варіант_11.docx</w:t>
+        <w:br/>
+        <w:t xml:space="preserve">git add Звіт_ЛР2_варіант_11.docx</w:t>
+        <w:br/>
+        <w:t xml:space="preserve">git commit -m "Remove laboratory work 1 report"</w:t>
+        <w:br/>
+        <w:t xml:space="preserve">git push origin main</w:t>
       </w:r>
     </w:p>
     <w:p>
@@ -4102,6 +4110,8 @@
           <w:szCs w:val="17"/>
           <w:rtl w:val="0"/>
         </w:rPr>
+        <w:t xml:space="preserve">bc7e01d Add laboratory work 2 report</w:t>
+        <w:br/>
         <w:t xml:space="preserve">143e001 Document laboratory work 2 in README</w:t>
         <w:br/>
         <w:t xml:space="preserve">93244b9 Add tests for processors, analytics and decorators</w:t>
@@ -4135,7 +4145,7 @@
         <w:rPr>
           <w:rtl w:val="0"/>
         </w:rPr>
-        <w:t xml:space="preserve">Перші 6 рядків — коміти лабораторної роботи №2, решта — лабораторної роботи №1. Над ними в репозиторії розташований сьомий коміт лабораторної роботи №2 — «Add laboratory work 2 report», тому фінальна історія github.com/NKobryn/restaurant-orders містить 12 комітів.</w:t>
+        <w:t xml:space="preserve">Перші 7 рядків — коміти лабораторної роботи №2, решта — лабораторної роботи №1. Над ними в репозиторії розташований восьмий коміт лабораторної роботи №2 — «Remove laboratory work 1 report», тому фінальна історія github.com/NKobryn/restaurant-orders містить 13 комітів.</w:t>
       </w:r>
     </w:p>
     <w:p>

</xml_diff>